<commit_message>
Remove key, description; source required
</commit_message>
<xml_diff>
--- a/templates/manufacturing_act.docx
+++ b/templates/manufacturing_act.docx
@@ -32,13 +32,13 @@
       <w:pPr>
         <w:spacing w:line="432" w:lineRule="auto"/>
         <w:jc w:val="center"/>
-        <w:rPr/>
-      </w:pPr>
-      <w:r>
-        <w:rPr>
-          <w:rtl w:val="0"/>
-        </w:rPr>
-        <w:t xml:space="preserve">От «13» марта 2026 г.</w:t>
+      </w:pPr>
+      <w:r>
+        <w:rPr>
+          <w:sz w:val="24"/>
+          <w:szCs w:val="24"/>
+        </w:rPr>
+        <w:t>От {{date}}</w:t>
       </w:r>
     </w:p>
     <w:p>
@@ -73,45 +73,69 @@
       <w:pPr>
         <w:spacing w:line="432" w:lineRule="auto"/>
         <w:jc w:val="both"/>
-        <w:rPr/>
-      </w:pPr>
-      <w:r>
-        <w:rPr>
-          <w:rtl w:val="0"/>
-        </w:rPr>
-        <w:t xml:space="preserve">2.</w:t>
+      </w:pPr>
+      <w:r>
+        <w:rPr>
+          <w:sz w:val="24"/>
+          <w:szCs w:val="24"/>
+        </w:rPr>
+        <w:t>2.</w:t>
+      </w:r>
+      <w:r>
         <w:tab/>
-        <w:t xml:space="preserve">Код (шифр, лабораторный номер) образца: </w:t>
-      </w:r>
-    </w:p>
-    <w:p>
-      <w:pPr>
-        <w:spacing w:line="432" w:lineRule="auto"/>
-        <w:jc w:val="both"/>
-        <w:rPr/>
-      </w:pPr>
-      <w:r>
-        <w:rPr>
-          <w:rtl w:val="0"/>
-        </w:rPr>
-        <w:t xml:space="preserve">3.</w:t>
+      </w:r>
+      <w:r>
+        <w:rPr>
+          <w:sz w:val="24"/>
+          <w:szCs w:val="24"/>
+        </w:rPr>
+        <w:t>Код (шифр, лабораторный номер) образца: {{code}}</w:t>
+      </w:r>
+    </w:p>
+    <w:p>
+      <w:pPr>
+        <w:spacing w:line="432" w:lineRule="auto"/>
+        <w:jc w:val="both"/>
+      </w:pPr>
+      <w:r>
+        <w:rPr>
+          <w:sz w:val="24"/>
+          <w:szCs w:val="24"/>
+        </w:rPr>
+        <w:t>3.</w:t>
+      </w:r>
+      <w:r>
         <w:tab/>
-        <w:t xml:space="preserve">Дата изготовления (или период): </w:t>
-      </w:r>
-    </w:p>
-    <w:p>
-      <w:pPr>
-        <w:spacing w:line="432" w:lineRule="auto"/>
-        <w:jc w:val="both"/>
-        <w:rPr/>
-      </w:pPr>
-      <w:r>
-        <w:rPr>
-          <w:rtl w:val="0"/>
-        </w:rPr>
-        <w:t xml:space="preserve">4.</w:t>
+      </w:r>
+      <w:r>
+        <w:rPr>
+          <w:sz w:val="24"/>
+          <w:szCs w:val="24"/>
+        </w:rPr>
+        <w:t>Дата изготовления (или период): {{date}}</w:t>
+      </w:r>
+    </w:p>
+    <w:p>
+      <w:pPr>
+        <w:spacing w:line="432" w:lineRule="auto"/>
+        <w:jc w:val="both"/>
+      </w:pPr>
+      <w:r>
+        <w:rPr>
+          <w:sz w:val="24"/>
+          <w:szCs w:val="24"/>
+        </w:rPr>
+        <w:t>4.</w:t>
+      </w:r>
+      <w:r>
         <w:tab/>
-        <w:t xml:space="preserve">Внешний вид образца: </w:t>
+      </w:r>
+      <w:r>
+        <w:rPr>
+          <w:sz w:val="24"/>
+          <w:szCs w:val="24"/>
+        </w:rPr>
+        <w:t>Внешний вид образца: {{sample}}</w:t>
       </w:r>
     </w:p>
     <w:p>
@@ -133,45 +157,69 @@
       <w:pPr>
         <w:spacing w:line="432" w:lineRule="auto"/>
         <w:jc w:val="both"/>
-        <w:rPr/>
-      </w:pPr>
-      <w:r>
-        <w:rPr>
-          <w:rtl w:val="0"/>
-        </w:rPr>
-        <w:t xml:space="preserve">6.</w:t>
+      </w:pPr>
+      <w:r>
+        <w:rPr>
+          <w:sz w:val="24"/>
+          <w:szCs w:val="24"/>
+        </w:rPr>
+        <w:t>6.</w:t>
+      </w:r>
+      <w:r>
         <w:tab/>
-        <w:t xml:space="preserve">Цель работ: </w:t>
-      </w:r>
-    </w:p>
-    <w:p>
-      <w:pPr>
-        <w:spacing w:line="432" w:lineRule="auto"/>
-        <w:jc w:val="both"/>
-        <w:rPr/>
-      </w:pPr>
-      <w:r>
-        <w:rPr>
-          <w:rtl w:val="0"/>
-        </w:rPr>
-        <w:t xml:space="preserve">7.</w:t>
+      </w:r>
+      <w:r>
+        <w:rPr>
+          <w:sz w:val="24"/>
+          <w:szCs w:val="24"/>
+        </w:rPr>
+        <w:t>Цель работ: {{goal}}</w:t>
+      </w:r>
+    </w:p>
+    <w:p>
+      <w:pPr>
+        <w:spacing w:line="432" w:lineRule="auto"/>
+        <w:jc w:val="both"/>
+      </w:pPr>
+      <w:r>
+        <w:rPr>
+          <w:sz w:val="24"/>
+          <w:szCs w:val="24"/>
+        </w:rPr>
+        <w:t>7.</w:t>
+      </w:r>
+      <w:r>
         <w:tab/>
-        <w:t xml:space="preserve">Краткое описание работ: </w:t>
-      </w:r>
-    </w:p>
-    <w:p>
-      <w:pPr>
-        <w:spacing w:line="432" w:lineRule="auto"/>
-        <w:jc w:val="both"/>
-        <w:rPr/>
-      </w:pPr>
-      <w:r>
-        <w:rPr>
-          <w:rtl w:val="0"/>
-        </w:rPr>
-        <w:t xml:space="preserve">8.</w:t>
+      </w:r>
+      <w:r>
+        <w:rPr>
+          <w:sz w:val="24"/>
+          <w:szCs w:val="24"/>
+        </w:rPr>
+        <w:t>Краткое описание работ: {{description}}</w:t>
+      </w:r>
+    </w:p>
+    <w:p>
+      <w:pPr>
+        <w:spacing w:line="432" w:lineRule="auto"/>
+        <w:jc w:val="both"/>
+      </w:pPr>
+      <w:r>
+        <w:rPr>
+          <w:sz w:val="24"/>
+          <w:szCs w:val="24"/>
+        </w:rPr>
+        <w:t>8.</w:t>
+      </w:r>
+      <w:r>
         <w:tab/>
-        <w:t xml:space="preserve">Заключение: </w:t>
+      </w:r>
+      <w:r>
+        <w:rPr>
+          <w:sz w:val="24"/>
+          <w:szCs w:val="24"/>
+        </w:rPr>
+        <w:t>Заключение: {{conclusion}}</w:t>
       </w:r>
     </w:p>
     <w:p>

</xml_diff>